<commit_message>
Clarify Round 3 billing test card
</commit_message>
<xml_diff>
--- a/public/downloads/capitol-ledger-round-3-beta-tester-guide.docx
+++ b/public/downloads/capitol-ledger-round-3-beta-tester-guide.docx
@@ -480,6 +480,11 @@
       </w:r>
     </w:p>
     <w:p>
+      <w:r>
+        <w:t>If you are assigned to billing checkout, use Stripe's fake test card number only: 4242 4242 4242 4242. Use any future expiration date, any three-digit CVC, and any ZIP code. Never enter your real credit or debit card. If Stripe asks for a real card, stop and report it as High impact feedback.</w:t>
+      </w:r>
+    </w:p>
+    <w:p>
       <w:pPr>
         <w:pStyle w:val="ListNumber"/>
       </w:pPr>
@@ -968,6 +973,11 @@
     </w:p>
     <w:p>
       <w:r>
+        <w:t>The feedback form includes Round 3-specific areas for annual upgrade, Team invite acceptance, Team roles, Team seats, Team billing/downgrade, live civic data, AI Policy Lens, official statements/video, saved state/day streak, and service history. Choose the closest area so reports land in the right review bucket.</w:t>
+      </w:r>
+    </w:p>
+    <w:p>
+      <w:r>
         <w:t>When reporting, include:</w:t>
       </w:r>
     </w:p>
@@ -1090,7 +1100,7 @@
         <w:pStyle w:val="ListBullet"/>
       </w:pPr>
       <w:r>
-        <w:t>Only assigned billing testers should complete Stripe checkout.</w:t>
+        <w:t>Only assigned billing testers should complete Stripe checkout, and they should use the fake Stripe test card 4242 4242 4242 4242, not a personal card.</w:t>
       </w:r>
     </w:p>
     <w:p>

</xml_diff>